<commit_message>
feat(pipeline): in-loop value conditions, token dedupe, docx table splicer
- [Name?] inside a loop with a non-coverage name is now an in-loop value
  region: per-item condition (rooted at the loop iterator) compiled to an
  in-template #if via condition_to_velocity; the plugin never sees it
- repeated [[$token]] occurrences dedupe instead of erroring
- condition_dsl: string/date field compared to a bare true/false now errors
  at validation with a "quote it" hint (was only caught at codegen)
- tools/splice_docx_table.py: copy a table between docx files with the
  source doc's effective defaults baked in (host docDefaults restyle raw
  <w:tbl> copies); verifies its own output
- docs: four-shape [Name?] resolution, splice section, writing-conditions
  callout that a field's registry category constrains which doc root can
  condition on it; regression fixtures + tests updated

Co-Authored-By: Claude Fable 5 <noreply@anthropic.com>
</commit_message>
<xml_diff>
--- a/tests/pipeline/fixtures/TestCoverageGrid(segment).docx
+++ b/tests/pipeline/fixtures/TestCoverageGrid(segment).docx
@@ -224,6 +224,78 @@
               <w:t>{item.Breakdown.data.partsCovered}</w:t>
             </w:r>
           </w:p>
+        </w:tc>
+      </w:tr>
+      <w:tr>
+        <w:tc>
+          <w:tcPr>
+            <w:tcW w:type="dxa" w:w="2880"/>
+          </w:tcPr>
+          <w:p>
+            <w:r>
+              <w:t>[BreakdownLabourRow?]</w:t>
+            </w:r>
+          </w:p>
+        </w:tc>
+        <w:tc>
+          <w:tcPr>
+            <w:tcW w:type="dxa" w:w="2880"/>
+          </w:tcPr>
+          <w:p/>
+        </w:tc>
+        <w:tc>
+          <w:tcPr>
+            <w:tcW w:type="dxa" w:w="2880"/>
+          </w:tcPr>
+          <w:p/>
+        </w:tc>
+      </w:tr>
+      <w:tr>
+        <w:tc>
+          <w:tcPr>
+            <w:tcW w:type="dxa" w:w="2880"/>
+          </w:tcPr>
+          <w:p>
+            <w:r>
+              <w:t>Breakdown labour is covered for this item.</w:t>
+            </w:r>
+          </w:p>
+        </w:tc>
+        <w:tc>
+          <w:tcPr>
+            <w:tcW w:type="dxa" w:w="2880"/>
+          </w:tcPr>
+          <w:p/>
+        </w:tc>
+        <w:tc>
+          <w:tcPr>
+            <w:tcW w:type="dxa" w:w="2880"/>
+          </w:tcPr>
+          <w:p/>
+        </w:tc>
+      </w:tr>
+      <w:tr>
+        <w:tc>
+          <w:tcPr>
+            <w:tcW w:type="dxa" w:w="2880"/>
+          </w:tcPr>
+          <w:p>
+            <w:r>
+              <w:t>[/BreakdownLabourRow]</w:t>
+            </w:r>
+          </w:p>
+        </w:tc>
+        <w:tc>
+          <w:tcPr>
+            <w:tcW w:type="dxa" w:w="2880"/>
+          </w:tcPr>
+          <w:p/>
+        </w:tc>
+        <w:tc>
+          <w:tcPr>
+            <w:tcW w:type="dxa" w:w="2880"/>
+          </w:tcPr>
+          <w:p/>
         </w:tc>
       </w:tr>
       <w:tr>

</xml_diff>